<commit_message>
docs(qms): approvals AR-2026-007 and AR-2026-008
Alexander Peter (review), Kishan Haravu Pradeep (data protection, AR-008),
Sheryl Nazareth (QA) and Anita Johan (Managing Director) confirmed on
2026-10-20:

- AR-2026-007: revision 1.1 of EM26-24 Test Plan, EM26-26 Use Cases,
  EM26-27 Client Communication Record and Log, EM26-30 Requirement Change
  Record, EM26-31 Design and Development Record; EM26-33 process,
  EM26-34 test execution register, release notes RN-v1.0.0 … v1.4.1
- AR-2026-008: EM26-35 AI Impact Assessment, SOP-05 rev 1.2 (§7a),
  REG-03 R-15 … R-18 and O-05, response to audit finding 6 (OFI-2026-06)

REG-01, QM-01, REG-03, REG-04 updated; audit pack documents signed;
QMS Word copies regenerated. OFI-2026-06 stays open until effectiveness
is verified at the internal audit.

Co-Authored-By: Claude Opus 5.5 <noreply@anthropic.com>
</commit_message>
<xml_diff>
--- a/docs/EchoMind_Audit_2026-10-14_Project2/03_Communication_with_Client/EM26-27_Client_Communication_Record.docx
+++ b/docs/EchoMind_Audit_2026-10-14_Project2/03_Communication_with_Client/EM26-27_Client_Communication_Record.docx
@@ -421,7 +421,7 @@
                 <w:sz w:val="17"/>
                 <w:szCs w:val="17"/>
               </w:rPr>
-              <w:t xml:space="preserve">Rev 1.1 issued for approval; rev 1.0 approved 2026-10-13 (AR-2026-005)</w:t>
+              <w:t xml:space="preserve">APPROVED — rev 1.1 2026-10-20 (AR-2026-007); rev 1.0 approved 2026-10-13 (AR-2026-005)</w:t>
             </w:r>
           </w:p>
         </w:tc>
@@ -781,7 +781,7 @@
                 <w:sz w:val="17"/>
                 <w:szCs w:val="17"/>
               </w:rPr>
-              <w:t xml:space="preserve">Alexander Peter (EchoMind Project Lead) — rev 1.1 to confirm</w:t>
+              <w:t xml:space="preserve">Alexander Peter (EchoMind Project Lead) — 2026-10-20</w:t>
             </w:r>
           </w:p>
         </w:tc>
@@ -841,7 +841,7 @@
                 <w:sz w:val="17"/>
                 <w:szCs w:val="17"/>
               </w:rPr>
-              <w:t xml:space="preserve">Sheryl Nazareth (QA / MR) — rev 1.1 to confirm</w:t>
+              <w:t xml:space="preserve">Sheryl Nazareth (QA / MR) — 2026-10-20</w:t>
             </w:r>
           </w:p>
         </w:tc>
@@ -901,7 +901,7 @@
                 <w:sz w:val="17"/>
                 <w:szCs w:val="17"/>
               </w:rPr>
-              <w:t xml:space="preserve">Anita Johan (Managing Director) — rev 1.1 to confirm</w:t>
+              <w:t xml:space="preserve">Anita Johan (Managing Director) — 2026-10-20</w:t>
             </w:r>
           </w:p>
         </w:tc>

</xml_diff>